<commit_message>
docs: update README and project brief with PING check type
Co-Authored-By: Claude Sonnet 4.6 <noreply@anthropic.com>
</commit_message>
<xml_diff>
--- a/PulseWatch v2.docx
+++ b/PulseWatch v2.docx
@@ -670,6 +670,20 @@
         <w:t xml:space="preserve">✅  </w:t>
       </w:r>
       <w:r>
+        <w:t>PING checks — execFile(ping) with real ICMP RTT parsing; no npm, no raw sockets needed</w:t>
+      </w:r>
+    </w:p>
+    <w:p>
+      <w:pPr>
+        <w:pStyle w:val="ListBullet"/>
+      </w:pPr>
+      <w:r>
+        <w:rPr>
+          <w:color w:val="059669"/>
+        </w:rPr>
+        <w:t xml:space="preserve">✅  </w:t>
+      </w:r>
+      <w:r>
         <w:t>Per-service check interval (default 30s, configurable per service)</w:t>
       </w:r>
     </w:p>
@@ -1572,12 +1586,12 @@
       </w:pPr>
       <w:r>
         <w:rPr>
-          <w:color w:val="64748B"/>
+          <w:color w:val="059669"/>
         </w:rPr>
-        <w:t xml:space="preserve">⬜  </w:t>
+        <w:t xml:space="preserve">✅  </w:t>
       </w:r>
       <w:r>
-        <w:t>PING check type (third check type alongside HTTP and TCP)</w:t>
+        <w:t>PING check type — uses system ping binary, parses real ICMP RTT</w:t>
       </w:r>
     </w:p>
     <w:p>

</xml_diff>